<commit_message>
fix(offers): complete Annexure-A salary component breakdown
Co-authored-by: Cursor <cursoragent@cursor.com>
</commit_message>
<xml_diff>
--- a/assets/templates/offer-letter-v1.docx
+++ b/assets/templates/offer-letter-v1.docx
@@ -3695,6 +3695,450 @@
       </w:tr>
       <w:tr>
         <w:trPr>
+          <w:trHeight w:val="288"/>
+        </w:trPr>
+        <w:tc>
+          <w:tcPr>
+            <w:tcW w:w="3584" w:type="dxa"/>
+            <w:tcBorders>
+              <w:top w:val="nil"/>
+              <w:left w:val="single" w:sz="4" w:space="0" w:color="auto"/>
+              <w:bottom w:val="single" w:sz="4" w:space="0" w:color="auto"/>
+              <w:right w:val="single" w:sz="4" w:space="0" w:color="auto"/>
+            </w:tcBorders>
+            <w:noWrap/>
+            <w:vAlign w:val="center"/>
+          </w:tcPr>
+          <w:p>
+            <w:pPr>
+              <w:rPr>
+                <w:rFonts w:ascii="Arial" w:hAnsi="Arial" w:cs="Arial"/>
+                <w:color w:val="000000"/>
+                <w:lang w:val="en-GB" w:eastAsia="en-GB"/>
+              </w:rPr>
+            </w:pPr>
+            <w:r>
+              <w:rPr>
+                <w:rFonts w:ascii="Arial" w:hAnsi="Arial" w:cs="Arial"/>
+                <w:color w:val="000000"/>
+                <w:lang w:val="en-GB" w:eastAsia="en-GB"/>
+              </w:rPr>
+              <w:t>Conveyance</w:t>
+            </w:r>
+          </w:p>
+        </w:tc>
+        <w:tc>
+          <w:tcPr>
+            <w:tcW w:w="2870" w:type="dxa"/>
+            <w:tcBorders>
+              <w:top w:val="nil"/>
+              <w:left w:val="nil"/>
+              <w:bottom w:val="single" w:sz="4" w:space="0" w:color="auto"/>
+              <w:right w:val="single" w:sz="4" w:space="0" w:color="auto"/>
+            </w:tcBorders>
+            <w:vAlign w:val="center"/>
+          </w:tcPr>
+          <w:p>
+            <w:pPr>
+              <w:jc w:val="right"/>
+              <w:rPr>
+                <w:rFonts w:ascii="Arial" w:hAnsi="Arial" w:cs="Arial"/>
+              </w:rPr>
+            </w:pPr>
+          </w:p>
+          <w:p>
+            <w:pPr>
+              <w:jc w:val="right"/>
+              <w:rPr>
+                <w:rFonts w:ascii="Arial" w:hAnsi="Arial" w:cs="Arial"/>
+                <w:color w:val="000000"/>
+                <w:lang w:val="en-GB" w:eastAsia="en-GB"/>
+              </w:rPr>
+            </w:pPr>
+            <w:r>
+              <w:rPr>
+                <w:rFonts w:ascii="Arial" w:hAnsi="Arial" w:cs="Arial"/>
+              </w:rPr>
+              <w:t>00,000.00</w:t>
+            </w:r>
+          </w:p>
+        </w:tc>
+        <w:tc>
+          <w:tcPr>
+            <w:tcW w:w="2663" w:type="dxa"/>
+            <w:tcBorders>
+              <w:top w:val="nil"/>
+              <w:left w:val="nil"/>
+              <w:bottom w:val="single" w:sz="4" w:space="0" w:color="auto"/>
+              <w:right w:val="single" w:sz="4" w:space="0" w:color="auto"/>
+            </w:tcBorders>
+            <w:vAlign w:val="center"/>
+          </w:tcPr>
+          <w:p>
+            <w:pPr>
+              <w:jc w:val="right"/>
+              <w:rPr>
+                <w:rFonts w:ascii="Arial" w:hAnsi="Arial" w:cs="Arial"/>
+              </w:rPr>
+            </w:pPr>
+            <w:r>
+              <w:rPr>
+                <w:rFonts w:ascii="Arial" w:hAnsi="Arial" w:cs="Arial"/>
+              </w:rPr>
+              <w:t xml:space="preserve"> </w:t>
+            </w:r>
+          </w:p>
+          <w:p>
+            <w:pPr>
+              <w:jc w:val="right"/>
+              <w:rPr>
+                <w:rFonts w:ascii="Arial" w:hAnsi="Arial" w:cs="Arial"/>
+              </w:rPr>
+            </w:pPr>
+            <w:r>
+              <w:rPr>
+                <w:rFonts w:ascii="Arial" w:hAnsi="Arial" w:cs="Arial"/>
+              </w:rPr>
+              <w:t>00,000.00</w:t>
+            </w:r>
+          </w:p>
+        </w:tc>
+      </w:tr>
+      <w:tr>
+        <w:trPr>
+          <w:trHeight w:val="288"/>
+        </w:trPr>
+        <w:tc>
+          <w:tcPr>
+            <w:tcW w:w="3584" w:type="dxa"/>
+            <w:tcBorders>
+              <w:top w:val="nil"/>
+              <w:left w:val="single" w:sz="4" w:space="0" w:color="auto"/>
+              <w:bottom w:val="single" w:sz="4" w:space="0" w:color="auto"/>
+              <w:right w:val="single" w:sz="4" w:space="0" w:color="auto"/>
+            </w:tcBorders>
+            <w:noWrap/>
+            <w:vAlign w:val="center"/>
+          </w:tcPr>
+          <w:p>
+            <w:pPr>
+              <w:rPr>
+                <w:rFonts w:ascii="Arial" w:hAnsi="Arial" w:cs="Arial"/>
+                <w:color w:val="000000"/>
+                <w:lang w:val="en-GB" w:eastAsia="en-GB"/>
+              </w:rPr>
+            </w:pPr>
+            <w:r>
+              <w:rPr>
+                <w:rFonts w:ascii="Arial" w:hAnsi="Arial" w:cs="Arial"/>
+                <w:color w:val="000000"/>
+                <w:lang w:val="en-GB" w:eastAsia="en-GB"/>
+              </w:rPr>
+              <w:t>Medical Reimbursement</w:t>
+            </w:r>
+          </w:p>
+        </w:tc>
+        <w:tc>
+          <w:tcPr>
+            <w:tcW w:w="2870" w:type="dxa"/>
+            <w:tcBorders>
+              <w:top w:val="nil"/>
+              <w:left w:val="nil"/>
+              <w:bottom w:val="single" w:sz="4" w:space="0" w:color="auto"/>
+              <w:right w:val="single" w:sz="4" w:space="0" w:color="auto"/>
+            </w:tcBorders>
+            <w:vAlign w:val="center"/>
+          </w:tcPr>
+          <w:p>
+            <w:pPr>
+              <w:jc w:val="right"/>
+              <w:rPr>
+                <w:rFonts w:ascii="Arial" w:hAnsi="Arial" w:cs="Arial"/>
+              </w:rPr>
+            </w:pPr>
+          </w:p>
+          <w:p>
+            <w:pPr>
+              <w:jc w:val="right"/>
+              <w:rPr>
+                <w:rFonts w:ascii="Arial" w:hAnsi="Arial" w:cs="Arial"/>
+                <w:color w:val="000000"/>
+                <w:lang w:val="en-GB" w:eastAsia="en-GB"/>
+              </w:rPr>
+            </w:pPr>
+            <w:r>
+              <w:rPr>
+                <w:rFonts w:ascii="Arial" w:hAnsi="Arial" w:cs="Arial"/>
+              </w:rPr>
+              <w:t>00,000.00</w:t>
+            </w:r>
+          </w:p>
+        </w:tc>
+        <w:tc>
+          <w:tcPr>
+            <w:tcW w:w="2663" w:type="dxa"/>
+            <w:tcBorders>
+              <w:top w:val="nil"/>
+              <w:left w:val="nil"/>
+              <w:bottom w:val="single" w:sz="4" w:space="0" w:color="auto"/>
+              <w:right w:val="single" w:sz="4" w:space="0" w:color="auto"/>
+            </w:tcBorders>
+            <w:vAlign w:val="center"/>
+          </w:tcPr>
+          <w:p>
+            <w:pPr>
+              <w:jc w:val="right"/>
+              <w:rPr>
+                <w:rFonts w:ascii="Arial" w:hAnsi="Arial" w:cs="Arial"/>
+              </w:rPr>
+            </w:pPr>
+            <w:r>
+              <w:rPr>
+                <w:rFonts w:ascii="Arial" w:hAnsi="Arial" w:cs="Arial"/>
+              </w:rPr>
+              <w:t xml:space="preserve"> </w:t>
+            </w:r>
+          </w:p>
+          <w:p>
+            <w:pPr>
+              <w:jc w:val="right"/>
+              <w:rPr>
+                <w:rFonts w:ascii="Arial" w:hAnsi="Arial" w:cs="Arial"/>
+              </w:rPr>
+            </w:pPr>
+            <w:r>
+              <w:rPr>
+                <w:rFonts w:ascii="Arial" w:hAnsi="Arial" w:cs="Arial"/>
+              </w:rPr>
+              <w:t>00,000.00</w:t>
+            </w:r>
+          </w:p>
+        </w:tc>
+      </w:tr>
+      <w:tr>
+        <w:trPr>
+          <w:trHeight w:val="288"/>
+        </w:trPr>
+        <w:tc>
+          <w:tcPr>
+            <w:tcW w:w="3584" w:type="dxa"/>
+            <w:tcBorders>
+              <w:top w:val="nil"/>
+              <w:left w:val="single" w:sz="4" w:space="0" w:color="auto"/>
+              <w:bottom w:val="single" w:sz="4" w:space="0" w:color="auto"/>
+              <w:right w:val="single" w:sz="4" w:space="0" w:color="auto"/>
+            </w:tcBorders>
+            <w:noWrap/>
+            <w:vAlign w:val="center"/>
+          </w:tcPr>
+          <w:p>
+            <w:pPr>
+              <w:rPr>
+                <w:rFonts w:ascii="Arial" w:hAnsi="Arial" w:cs="Arial"/>
+                <w:color w:val="000000"/>
+                <w:lang w:val="en-GB" w:eastAsia="en-GB"/>
+              </w:rPr>
+            </w:pPr>
+            <w:r>
+              <w:rPr>
+                <w:rFonts w:ascii="Arial" w:hAnsi="Arial" w:cs="Arial"/>
+                <w:color w:val="000000"/>
+                <w:lang w:val="en-GB" w:eastAsia="en-GB"/>
+              </w:rPr>
+              <w:t>Education</w:t>
+            </w:r>
+          </w:p>
+        </w:tc>
+        <w:tc>
+          <w:tcPr>
+            <w:tcW w:w="2870" w:type="dxa"/>
+            <w:tcBorders>
+              <w:top w:val="nil"/>
+              <w:left w:val="nil"/>
+              <w:bottom w:val="single" w:sz="4" w:space="0" w:color="auto"/>
+              <w:right w:val="single" w:sz="4" w:space="0" w:color="auto"/>
+            </w:tcBorders>
+            <w:vAlign w:val="center"/>
+          </w:tcPr>
+          <w:p>
+            <w:pPr>
+              <w:jc w:val="right"/>
+              <w:rPr>
+                <w:rFonts w:ascii="Arial" w:hAnsi="Arial" w:cs="Arial"/>
+              </w:rPr>
+            </w:pPr>
+          </w:p>
+          <w:p>
+            <w:pPr>
+              <w:jc w:val="right"/>
+              <w:rPr>
+                <w:rFonts w:ascii="Arial" w:hAnsi="Arial" w:cs="Arial"/>
+                <w:color w:val="000000"/>
+                <w:lang w:val="en-GB" w:eastAsia="en-GB"/>
+              </w:rPr>
+            </w:pPr>
+            <w:r>
+              <w:rPr>
+                <w:rFonts w:ascii="Arial" w:hAnsi="Arial" w:cs="Arial"/>
+              </w:rPr>
+              <w:t>00,000.00</w:t>
+            </w:r>
+          </w:p>
+        </w:tc>
+        <w:tc>
+          <w:tcPr>
+            <w:tcW w:w="2663" w:type="dxa"/>
+            <w:tcBorders>
+              <w:top w:val="nil"/>
+              <w:left w:val="nil"/>
+              <w:bottom w:val="single" w:sz="4" w:space="0" w:color="auto"/>
+              <w:right w:val="single" w:sz="4" w:space="0" w:color="auto"/>
+            </w:tcBorders>
+            <w:vAlign w:val="center"/>
+          </w:tcPr>
+          <w:p>
+            <w:pPr>
+              <w:jc w:val="right"/>
+              <w:rPr>
+                <w:rFonts w:ascii="Arial" w:hAnsi="Arial" w:cs="Arial"/>
+              </w:rPr>
+            </w:pPr>
+            <w:r>
+              <w:rPr>
+                <w:rFonts w:ascii="Arial" w:hAnsi="Arial" w:cs="Arial"/>
+              </w:rPr>
+              <w:t xml:space="preserve"> </w:t>
+            </w:r>
+          </w:p>
+          <w:p>
+            <w:pPr>
+              <w:jc w:val="right"/>
+              <w:rPr>
+                <w:rFonts w:ascii="Arial" w:hAnsi="Arial" w:cs="Arial"/>
+              </w:rPr>
+            </w:pPr>
+            <w:r>
+              <w:rPr>
+                <w:rFonts w:ascii="Arial" w:hAnsi="Arial" w:cs="Arial"/>
+              </w:rPr>
+              <w:t>00,000.00</w:t>
+            </w:r>
+          </w:p>
+        </w:tc>
+      </w:tr>
+      <w:tr>
+        <w:trPr>
+          <w:trHeight w:val="288"/>
+        </w:trPr>
+        <w:tc>
+          <w:tcPr>
+            <w:tcW w:w="3584" w:type="dxa"/>
+            <w:tcBorders>
+              <w:top w:val="nil"/>
+              <w:left w:val="single" w:sz="4" w:space="0" w:color="auto"/>
+              <w:bottom w:val="single" w:sz="4" w:space="0" w:color="auto"/>
+              <w:right w:val="single" w:sz="4" w:space="0" w:color="auto"/>
+            </w:tcBorders>
+            <w:noWrap/>
+            <w:vAlign w:val="center"/>
+          </w:tcPr>
+          <w:p>
+            <w:pPr>
+              <w:rPr>
+                <w:rFonts w:ascii="Arial" w:hAnsi="Arial" w:cs="Arial"/>
+                <w:color w:val="000000"/>
+                <w:lang w:val="en-GB" w:eastAsia="en-GB"/>
+              </w:rPr>
+            </w:pPr>
+            <w:r>
+              <w:rPr>
+                <w:rFonts w:ascii="Arial" w:hAnsi="Arial" w:cs="Arial"/>
+                <w:color w:val="000000"/>
+                <w:lang w:val="en-GB" w:eastAsia="en-GB"/>
+              </w:rPr>
+              <w:t>Special Allowance</w:t>
+            </w:r>
+          </w:p>
+        </w:tc>
+        <w:tc>
+          <w:tcPr>
+            <w:tcW w:w="2870" w:type="dxa"/>
+            <w:tcBorders>
+              <w:top w:val="nil"/>
+              <w:left w:val="nil"/>
+              <w:bottom w:val="single" w:sz="4" w:space="0" w:color="auto"/>
+              <w:right w:val="single" w:sz="4" w:space="0" w:color="auto"/>
+            </w:tcBorders>
+            <w:vAlign w:val="center"/>
+          </w:tcPr>
+          <w:p>
+            <w:pPr>
+              <w:jc w:val="right"/>
+              <w:rPr>
+                <w:rFonts w:ascii="Arial" w:hAnsi="Arial" w:cs="Arial"/>
+              </w:rPr>
+            </w:pPr>
+          </w:p>
+          <w:p>
+            <w:pPr>
+              <w:jc w:val="right"/>
+              <w:rPr>
+                <w:rFonts w:ascii="Arial" w:hAnsi="Arial" w:cs="Arial"/>
+                <w:color w:val="000000"/>
+                <w:lang w:val="en-GB" w:eastAsia="en-GB"/>
+              </w:rPr>
+            </w:pPr>
+            <w:r>
+              <w:rPr>
+                <w:rFonts w:ascii="Arial" w:hAnsi="Arial" w:cs="Arial"/>
+              </w:rPr>
+              <w:t>00,000.00</w:t>
+            </w:r>
+          </w:p>
+        </w:tc>
+        <w:tc>
+          <w:tcPr>
+            <w:tcW w:w="2663" w:type="dxa"/>
+            <w:tcBorders>
+              <w:top w:val="nil"/>
+              <w:left w:val="nil"/>
+              <w:bottom w:val="single" w:sz="4" w:space="0" w:color="auto"/>
+              <w:right w:val="single" w:sz="4" w:space="0" w:color="auto"/>
+            </w:tcBorders>
+            <w:vAlign w:val="center"/>
+          </w:tcPr>
+          <w:p>
+            <w:pPr>
+              <w:jc w:val="right"/>
+              <w:rPr>
+                <w:rFonts w:ascii="Arial" w:hAnsi="Arial" w:cs="Arial"/>
+              </w:rPr>
+            </w:pPr>
+            <w:r>
+              <w:rPr>
+                <w:rFonts w:ascii="Arial" w:hAnsi="Arial" w:cs="Arial"/>
+              </w:rPr>
+              <w:t xml:space="preserve"> </w:t>
+            </w:r>
+          </w:p>
+          <w:p>
+            <w:pPr>
+              <w:jc w:val="right"/>
+              <w:rPr>
+                <w:rFonts w:ascii="Arial" w:hAnsi="Arial" w:cs="Arial"/>
+              </w:rPr>
+            </w:pPr>
+            <w:r>
+              <w:rPr>
+                <w:rFonts w:ascii="Arial" w:hAnsi="Arial" w:cs="Arial"/>
+              </w:rPr>
+              <w:t>00,000.00</w:t>
+            </w:r>
+          </w:p>
+        </w:tc>
+      </w:tr>
+      <w:tr>
+        <w:trPr>
           <w:trHeight w:val="439"/>
         </w:trPr>
         <w:tc>
@@ -4210,6 +4654,167 @@
                 <w:rFonts w:ascii="Arial" w:hAnsi="Arial" w:cs="Arial"/>
               </w:rPr>
               <w:t>00</w:t>
+            </w:r>
+          </w:p>
+        </w:tc>
+      </w:tr>
+      <w:tr>
+        <w:trPr>
+          <w:trHeight w:val="400"/>
+        </w:trPr>
+        <w:tc>
+          <w:tcPr>
+            <w:tcW w:w="3584" w:type="dxa"/>
+            <w:tcBorders>
+              <w:top w:val="nil"/>
+              <w:left w:val="single" w:sz="4" w:space="0" w:color="auto"/>
+              <w:bottom w:val="single" w:sz="4" w:space="0" w:color="auto"/>
+              <w:right w:val="single" w:sz="4" w:space="0" w:color="auto"/>
+            </w:tcBorders>
+            <w:noWrap/>
+            <w:vAlign w:val="center"/>
+          </w:tcPr>
+          <w:p>
+            <w:pPr>
+              <w:rPr>
+                <w:rFonts w:ascii="Arial" w:hAnsi="Arial" w:cs="Arial"/>
+                <w:color w:val="000000"/>
+                <w:lang w:val="en-GB" w:eastAsia="en-GB"/>
+              </w:rPr>
+            </w:pPr>
+            <w:r>
+              <w:rPr>
+                <w:rFonts w:ascii="Arial" w:hAnsi="Arial" w:cs="Arial"/>
+                <w:color w:val="000000"/>
+                <w:lang w:val="en-GB" w:eastAsia="en-GB"/>
+              </w:rPr>
+              <w:t>Mediclaim Insurance</w:t>
+            </w:r>
+          </w:p>
+        </w:tc>
+        <w:tc>
+          <w:tcPr>
+            <w:tcW w:w="2870" w:type="dxa"/>
+            <w:tcBorders>
+              <w:top w:val="nil"/>
+              <w:left w:val="nil"/>
+              <w:bottom w:val="single" w:sz="4" w:space="0" w:color="auto"/>
+              <w:right w:val="single" w:sz="4" w:space="0" w:color="auto"/>
+            </w:tcBorders>
+            <w:vAlign w:val="center"/>
+          </w:tcPr>
+          <w:p>
+            <w:pPr>
+              <w:jc w:val="right"/>
+              <w:rPr>
+                <w:rFonts w:ascii="Arial" w:hAnsi="Arial" w:cs="Arial"/>
+              </w:rPr>
+            </w:pPr>
+          </w:p>
+          <w:p>
+            <w:pPr>
+              <w:jc w:val="right"/>
+              <w:rPr>
+                <w:rFonts w:ascii="Arial" w:hAnsi="Arial" w:cs="Arial"/>
+                <w:color w:val="000000"/>
+                <w:lang w:val="en-GB" w:eastAsia="en-GB"/>
+              </w:rPr>
+            </w:pPr>
+            <w:r>
+              <w:rPr>
+                <w:rFonts w:ascii="Arial" w:hAnsi="Arial" w:cs="Arial"/>
+              </w:rPr>
+              <w:t>0</w:t>
+            </w:r>
+            <w:r>
+              <w:rPr>
+                <w:rFonts w:ascii="Arial" w:hAnsi="Arial" w:cs="Arial"/>
+              </w:rPr>
+              <w:t>,</w:t>
+            </w:r>
+            <w:r>
+              <w:rPr>
+                <w:rFonts w:ascii="Arial" w:hAnsi="Arial" w:cs="Arial"/>
+              </w:rPr>
+              <w:t>00</w:t>
+            </w:r>
+            <w:r>
+              <w:rPr>
+                <w:rFonts w:ascii="Arial" w:hAnsi="Arial" w:cs="Arial"/>
+              </w:rPr>
+              <w:t>0</w:t>
+            </w:r>
+            <w:r>
+              <w:rPr>
+                <w:rFonts w:ascii="Arial" w:hAnsi="Arial" w:cs="Arial"/>
+              </w:rPr>
+              <w:t>.00</w:t>
+            </w:r>
+          </w:p>
+        </w:tc>
+        <w:tc>
+          <w:tcPr>
+            <w:tcW w:w="2663" w:type="dxa"/>
+            <w:tcBorders>
+              <w:top w:val="nil"/>
+              <w:left w:val="nil"/>
+              <w:bottom w:val="single" w:sz="4" w:space="0" w:color="auto"/>
+              <w:right w:val="single" w:sz="4" w:space="0" w:color="auto"/>
+            </w:tcBorders>
+            <w:vAlign w:val="center"/>
+          </w:tcPr>
+          <w:p>
+            <w:pPr>
+              <w:jc w:val="right"/>
+              <w:rPr>
+                <w:rFonts w:ascii="Arial" w:hAnsi="Arial" w:cs="Arial"/>
+              </w:rPr>
+            </w:pPr>
+            <w:r>
+              <w:rPr>
+                <w:rFonts w:ascii="Arial" w:hAnsi="Arial" w:cs="Arial"/>
+              </w:rPr>
+              <w:t xml:space="preserve"> </w:t>
+            </w:r>
+          </w:p>
+          <w:p>
+            <w:pPr>
+              <w:jc w:val="right"/>
+              <w:rPr>
+                <w:rFonts w:ascii="Arial" w:hAnsi="Arial" w:cs="Arial"/>
+                <w:color w:val="000000"/>
+                <w:lang w:val="en-GB" w:eastAsia="en-GB"/>
+              </w:rPr>
+            </w:pPr>
+            <w:r>
+              <w:rPr>
+                <w:rFonts w:ascii="Arial" w:hAnsi="Arial" w:cs="Arial"/>
+              </w:rPr>
+              <w:t>00</w:t>
+            </w:r>
+            <w:r>
+              <w:rPr>
+                <w:rFonts w:ascii="Arial" w:hAnsi="Arial" w:cs="Arial"/>
+              </w:rPr>
+              <w:t>,</w:t>
+            </w:r>
+            <w:r>
+              <w:rPr>
+                <w:rFonts w:ascii="Arial" w:hAnsi="Arial" w:cs="Arial"/>
+              </w:rPr>
+              <w:t>00</w:t>
+            </w:r>
+            <w:r>
+              <w:rPr>
+                <w:rFonts w:ascii="Arial" w:hAnsi="Arial" w:cs="Arial"/>
+              </w:rPr>
+              <w:t>0</w:t>
+            </w:r>
+            <w:r>
+              <w:rPr>
+                <w:rFonts w:ascii="Arial" w:hAnsi="Arial" w:cs="Arial"/>
+              </w:rPr>
+              <w:t>.00</w:t>
             </w:r>
           </w:p>
         </w:tc>

</xml_diff>